<commit_message>
Fix stale default-login credentials in both deployment guides
Same fix as the READMEs: both .docx deployment guides still told
deployers to log in as admin@nexacrest.placeholder, which seed.sql has
never actually seeded. Replaced with the two real seeded Super Admin
accounts (gulmohar.sontakke@ and arti.sontakke@nexacrestinternational.com,
both password ChangeMe#2026). Also dropped an orphaned, empty
word/comments.xml left over in both files from an earlier edit that was
unreferenced by any relationship (caught by the docx validator).

Co-Authored-By: Claude Sonnet 5 <noreply@anthropic.com>
Claude-Session: https://claude.ai/code/session_01AKvYxJYrzixo23h6oBsh5w
</commit_message>
<xml_diff>
--- a/NODE_MySQL_Version/NexaCrest_Node_Deployment_Guide.docx
+++ b/NODE_MySQL_Version/NexaCrest_Node_Deployment_Guide.docx
@@ -1797,7 +1797,7 @@
       </w:r>
       <w:r>
         <w:rPr/>
-        <w:t xml:space="preserve"> with the seeded Admin account:</w:t>
+        <w:t xml:space="preserve"> with a seeded account (both Super Admin, both same password):</w:t>
       </w:r>
     </w:p>
     <w:p>
@@ -1818,7 +1818,7 @@
           <w:sz w:val="18"/>
           <w:szCs w:val="18"/>
         </w:rPr>
-        <w:t xml:space="preserve">admin@nexacrest.placeholder</w:t>
+        <w:t xml:space="preserve">gulmohar.sontakke@nexacrestinternational.com</w:t>
       </w:r>
     </w:p>
     <w:p>
@@ -1831,6 +1831,27 @@
       </w:pPr>
       <w:r>
         <w:rPr/>
+        <w:t xml:space="preserve">Email: </w:t>
+      </w:r>
+      <w:r>
+        <w:rPr>
+          <w:rFonts w:ascii="Consolas" w:hAnsi="Consolas" w:eastAsia="Consolas" w:cs="Consolas"/>
+          <w:sz w:val="18"/>
+          <w:szCs w:val="18"/>
+        </w:rPr>
+        <w:t xml:space="preserve">arti.sontakke@nexacrestinternational.com</w:t>
+      </w:r>
+    </w:p>
+    <w:p>
+      <w:pPr>
+        <w:spacing w:after="60"/>
+        <w:numPr>
+          <w:ilvl w:val="1"/>
+          <w:numId w:val="6"/>
+        </w:numPr>
+      </w:pPr>
+      <w:r>
+        <w:rPr/>
         <w:t xml:space="preserve">Password: </w:t>
       </w:r>
       <w:r>
@@ -1872,7 +1893,7 @@
       </w:r>
       <w:r>
         <w:rPr/>
-        <w:t xml:space="preserve"> is set on the seeded row).</w:t>
+        <w:t xml:space="preserve"> is set on both seeded rows).</w:t>
       </w:r>
     </w:p>
     <w:p>
@@ -5396,10 +5417,6 @@
     </w:sectPr>
   </w:body>
 </w:document>
-</file>
-
-<file path=word/comments.xml><?xml version="1.0" encoding="utf-8"?>
-<w:comments xmlns:ve="http://schemas.openxmlformats.org/markup-compatibility/2006" xmlns:o="urn:schemas-microsoft-com:office:office" xmlns:r="http://schemas.openxmlformats.org/officeDocument/2006/relationships" xmlns:m="http://schemas.openxmlformats.org/officeDocument/2006/math" xmlns:v="urn:schemas-microsoft-com:vml" xmlns:wp="http://schemas.openxmlformats.org/drawingml/2006/wordprocessingDrawing" xmlns:w10="urn:schemas-microsoft-com:office:word" xmlns:w="http://schemas.openxmlformats.org/wordprocessingml/2006/main" xmlns:wne="http://schemas.microsoft.com/office/word/2006/wordml"/>
 </file>
 
 <file path=word/numbering.xml><?xml version="1.0" encoding="utf-8"?>

</xml_diff>

<commit_message>
Team incentive program and associate register (both stacks)
Owner decision 2026-10-30, mockups approved. Team Incentives settings (on/off,
minimum order profit, reward table, new client bonus, role split, incentive
cut-off day, each person's incentive role), Step 12d on the order (reward for
this order, exclude, associate commission auto/yes/no, who did each role),
the associate register (India/abroad, currency, agreement rates, linked
clients), Incentive Payouts for Accounts by incentive month, and My
Incentives for each person. An order's figures are fixed when the buyer has
fully paid and become commission cost lines (team incentive, associate
commission) that go to Zoho Books as Commission Expense once paid.
Permissions: manage_incentives (Admin, MD), pay_incentives (+ Accounts
Executive), view_own_incentives. Migration 2026-10-30b, SOP chapter 20.

Co-Authored-By: Claude Opus 5.5 <noreply@anthropic.com>
Claude-Session: https://claude.ai/code/session_013MWU8K3FqMGawUYuNXSyb3
</commit_message>
<xml_diff>
--- a/NODE_MySQL_Version/NexaCrest_Node_Deployment_Guide.docx
+++ b/NODE_MySQL_Version/NexaCrest_Node_Deployment_Guide.docx
@@ -1105,7 +1105,7 @@
       </w:r>
       <w:r>
         <w:rPr/>
-        <w:t xml:space="preserve">. As of 29 Oct 2026 the live site still needs these 13, in this order (run from the repository root):</w:t>
+        <w:t xml:space="preserve">. As of 30 Oct 2026 the live site still needs these 14, in this order (run from the repository root):</w:t>
       </w:r>
     </w:p>
     <w:p>
@@ -1240,6 +1240,140 @@
           <w:szCs w:val="18"/>
         </w:rPr>
         <w:t xml:space="preserve">mysql -u &lt;db_user&gt; -p &lt;database&gt; &lt; docs/migrations/2026-10-30a-lc-payment-firc.sql</w:t>
+      </w:r>
+    </w:p>
+    <w:p>
+      <w:pPr>
+        <w:pStyle w:val="codeblock"/>
+      </w:pPr>
+      <w:r>
+        <w:rPr>
+          <w:rFonts w:ascii="Consolas" w:hAnsi="Consolas" w:eastAsia="Consolas" w:cs="Consolas"/>
+          <w:color w:val="1E3A5F"/>
+          <w:sz w:val="18"/>
+          <w:szCs w:val="18"/>
+        </w:rPr>
+        <w:t xml:space="preserve">mysql -u &lt;db_user&gt; -p &lt;database&gt; &lt; docs/migrations/2026-10-27f-document-date.sql</w:t>
+      </w:r>
+      <w:br/>
+      <w:r>
+        <w:rPr>
+          <w:rFonts w:ascii="Consolas" w:hAnsi="Consolas" w:eastAsia="Consolas" w:cs="Consolas"/>
+          <w:color w:val="1E3A5F"/>
+          <w:sz w:val="18"/>
+          <w:szCs w:val="18"/>
+        </w:rPr>
+        <w:t xml:space="preserve">mysql -u &lt;db_user&gt; -p &lt;database&gt; &lt; docs/migrations/2026-10-27g-logistics-bill-payment-kind.sql</w:t>
+      </w:r>
+      <w:br/>
+      <w:r>
+        <w:rPr>
+          <w:rFonts w:ascii="Consolas" w:hAnsi="Consolas" w:eastAsia="Consolas" w:cs="Consolas"/>
+          <w:color w:val="1E3A5F"/>
+          <w:sz w:val="18"/>
+          <w:szCs w:val="18"/>
+        </w:rPr>
+        <w:t xml:space="preserve">mysql -u &lt;db_user&gt; -p &lt;database&gt; &lt; docs/migrations/2026-10-28a-view-cafin-permission.sql</w:t>
+      </w:r>
+      <w:br/>
+      <w:r>
+        <w:rPr>
+          <w:rFonts w:ascii="Consolas" w:hAnsi="Consolas" w:eastAsia="Consolas" w:cs="Consolas"/>
+          <w:color w:val="1E3A5F"/>
+          <w:sz w:val="18"/>
+          <w:szCs w:val="18"/>
+        </w:rPr>
+        <w:t xml:space="preserve">mysql -u &lt;db_user&gt; -p &lt;database&gt; &lt; docs/migrations/2026-10-28c-payment-terms-approval.sql</w:t>
+      </w:r>
+      <w:br/>
+      <w:r>
+        <w:rPr>
+          <w:rFonts w:ascii="Consolas" w:hAnsi="Consolas" w:eastAsia="Consolas" w:cs="Consolas"/>
+          <w:color w:val="1E3A5F"/>
+          <w:sz w:val="18"/>
+          <w:szCs w:val="18"/>
+        </w:rPr>
+        <w:t xml:space="preserve">mysql -u &lt;db_user&gt; -p &lt;database&gt; &lt; docs/migrations/2026-10-28d-ca-view-orders.sql</w:t>
+      </w:r>
+      <w:br/>
+      <w:r>
+        <w:rPr>
+          <w:rFonts w:ascii="Consolas" w:hAnsi="Consolas" w:eastAsia="Consolas" w:cs="Consolas"/>
+          <w:color w:val="1E3A5F"/>
+          <w:sz w:val="18"/>
+          <w:szCs w:val="18"/>
+        </w:rPr>
+        <w:t xml:space="preserve">mysql -u &lt;db_user&gt; -p &lt;database&gt; &lt; docs/migrations/2026-10-28e-vendor-bill-proforma-and-payments.sql</w:t>
+      </w:r>
+      <w:br/>
+      <w:r>
+        <w:rPr>
+          <w:rFonts w:ascii="Consolas" w:hAnsi="Consolas" w:eastAsia="Consolas" w:cs="Consolas"/>
+          <w:color w:val="1E3A5F"/>
+          <w:sz w:val="18"/>
+          <w:szCs w:val="18"/>
+        </w:rPr>
+        <w:t xml:space="preserve">mysql -u &lt;db_user&gt; -p &lt;database&gt; &lt; docs/migrations/2026-10-29a-zoho-stage2-invoices.sql</w:t>
+      </w:r>
+      <w:br/>
+      <w:r>
+        <w:rPr>
+          <w:rFonts w:ascii="Consolas" w:hAnsi="Consolas" w:eastAsia="Consolas" w:cs="Consolas"/>
+          <w:color w:val="1E3A5F"/>
+          <w:sz w:val="18"/>
+          <w:szCs w:val="18"/>
+        </w:rPr>
+        <w:t xml:space="preserve">mysql -u &lt;db_user&gt; -p &lt;database&gt; &lt; docs/migrations/2026-10-29b-zoho-stage3-purchases.sql</w:t>
+      </w:r>
+      <w:br/>
+      <w:r>
+        <w:rPr>
+          <w:rFonts w:ascii="Consolas" w:hAnsi="Consolas" w:eastAsia="Consolas" w:cs="Consolas"/>
+          <w:color w:val="1E3A5F"/>
+          <w:sz w:val="18"/>
+          <w:szCs w:val="18"/>
+        </w:rPr>
+        <w:t xml:space="preserve">mysql -u &lt;db_user&gt; -p &lt;database&gt; &lt; docs/migrations/2026-10-29c-two-digit-year-references.sql</w:t>
+      </w:r>
+      <w:br/>
+      <w:r>
+        <w:rPr>
+          <w:rFonts w:ascii="Consolas" w:hAnsi="Consolas" w:eastAsia="Consolas" w:cs="Consolas"/>
+          <w:color w:val="1E3A5F"/>
+          <w:sz w:val="18"/>
+          <w:szCs w:val="18"/>
+        </w:rPr>
+        <w:t xml:space="preserve">mysql -u &lt;db_user&gt; -p &lt;database&gt; &lt; docs/migrations/2026-10-29d-zoho-sync-start-date.sql</w:t>
+      </w:r>
+      <w:br/>
+      <w:r>
+        <w:rPr>
+          <w:rFonts w:ascii="Consolas" w:hAnsi="Consolas" w:eastAsia="Consolas" w:cs="Consolas"/>
+          <w:color w:val="1E3A5F"/>
+          <w:sz w:val="18"/>
+          <w:szCs w:val="18"/>
+        </w:rPr>
+        <w:t xml:space="preserve">mysql -u &lt;db_user&gt; -p &lt;database&gt; &lt; docs/migrations/2026-10-29e-shipping-bill-and-reverse-charge.sql</w:t>
+      </w:r>
+      <w:br/>
+      <w:r>
+        <w:rPr>
+          <w:rFonts w:ascii="Consolas" w:hAnsi="Consolas" w:eastAsia="Consolas" w:cs="Consolas"/>
+          <w:color w:val="1E3A5F"/>
+          <w:sz w:val="18"/>
+          <w:szCs w:val="18"/>
+        </w:rPr>
+        <w:t xml:space="preserve">mysql -u &lt;db_user&gt; -p &lt;database&gt; &lt; docs/migrations/2026-10-29f-zoho-costs-lc-benefits.sql</w:t>
+      </w:r>
+      <w:br/>
+      <w:r>
+        <w:rPr>
+          <w:rFonts w:ascii="Consolas" w:hAnsi="Consolas" w:eastAsia="Consolas" w:cs="Consolas"/>
+          <w:color w:val="1E3A5F"/>
+          <w:sz w:val="18"/>
+          <w:szCs w:val="18"/>
+        </w:rPr>
+        <w:t xml:space="preserve">mysql -u &lt;db_user&gt; -p &lt;database&gt; &lt; docs/migrations/2026-10-30b-team-incentives.sql</w:t>
       </w:r>
     </w:p>
     <w:p>
@@ -3309,7 +3443,7 @@
       </w:r>
       <w:r>
         <w:rPr/>
-        <w:t xml:space="preserve"> back up, run every migration the live database does not have yet with the host's MySQL (2026-10-29e, 2026-10-29f and 2026-10-30a are the Zoho ones; see "Upgrading an existing installation" above), then deploy the code and restart Node (</w:t>
+        <w:t xml:space="preserve"> back up, run every migration the live database does not have yet with the host's MySQL (2026-10-29e, 2026-10-29f and 2026-10-30a are the Zoho ones, 2026-10-30b the team incentives; see "Upgrading an existing installation" above), then deploy the code and restart Node (</w:t>
       </w:r>
       <w:r>
         <w:rPr>

</xml_diff>

<commit_message>
Stage document notice at every gating step, Step 8a hint, CA sees all orders
Owner decisions 2026-10-30, both stacks:
- Each stage's gating button (Steps 4d, 5e, 6c, 7d, 9d, 10f, 11d) now says
  before the click which of the stage's documents still need generating,
  approving or sending, with a link to Document Review & Approval, and stays
  disabled until then (stageDocumentGate(), the rule stageDocumentBlockedBy()
  already enforces). The misleading Step 6c "unlocks immediately" text is
  reworded.
- Step 8a's hint now says only the estimated shipment date notifies the
  client.
- The CA / Chartered Accountant role sees every order, read-only
  (view_all_orders): migration 2026-10-30c.

Co-Authored-By: Claude Opus 5.5 <noreply@anthropic.com>
Claude-Session: https://claude.ai/code/session_013MWU8K3FqMGawUYuNXSyb3
</commit_message>
<xml_diff>
--- a/NODE_MySQL_Version/NexaCrest_Node_Deployment_Guide.docx
+++ b/NODE_MySQL_Version/NexaCrest_Node_Deployment_Guide.docx
@@ -1105,7 +1105,7 @@
       </w:r>
       <w:r>
         <w:rPr/>
-        <w:t xml:space="preserve">. As of 30 Oct 2026 the live site still needs these 14, in this order (run from the repository root):</w:t>
+        <w:t xml:space="preserve">. As of 30 Oct 2026 the live site still needs these 15, in this order (run from the repository root):</w:t>
       </w:r>
     </w:p>
     <w:p>
@@ -1374,6 +1374,140 @@
           <w:szCs w:val="18"/>
         </w:rPr>
         <w:t xml:space="preserve">mysql -u &lt;db_user&gt; -p &lt;database&gt; &lt; docs/migrations/2026-10-30b-team-incentives.sql</w:t>
+      </w:r>
+    </w:p>
+    <w:p>
+      <w:pPr>
+        <w:pStyle w:val="codeblock"/>
+      </w:pPr>
+      <w:r>
+        <w:rPr>
+          <w:rFonts w:ascii="Consolas" w:hAnsi="Consolas" w:eastAsia="Consolas" w:cs="Consolas"/>
+          <w:color w:val="1E3A5F"/>
+          <w:sz w:val="18"/>
+          <w:szCs w:val="18"/>
+        </w:rPr>
+        <w:t xml:space="preserve">mysql -u &lt;db_user&gt; -p &lt;database&gt; &lt; docs/migrations/2026-10-27f-document-date.sql</w:t>
+      </w:r>
+      <w:br/>
+      <w:r>
+        <w:rPr>
+          <w:rFonts w:ascii="Consolas" w:hAnsi="Consolas" w:eastAsia="Consolas" w:cs="Consolas"/>
+          <w:color w:val="1E3A5F"/>
+          <w:sz w:val="18"/>
+          <w:szCs w:val="18"/>
+        </w:rPr>
+        <w:t xml:space="preserve">mysql -u &lt;db_user&gt; -p &lt;database&gt; &lt; docs/migrations/2026-10-27g-logistics-bill-payment-kind.sql</w:t>
+      </w:r>
+      <w:br/>
+      <w:r>
+        <w:rPr>
+          <w:rFonts w:ascii="Consolas" w:hAnsi="Consolas" w:eastAsia="Consolas" w:cs="Consolas"/>
+          <w:color w:val="1E3A5F"/>
+          <w:sz w:val="18"/>
+          <w:szCs w:val="18"/>
+        </w:rPr>
+        <w:t xml:space="preserve">mysql -u &lt;db_user&gt; -p &lt;database&gt; &lt; docs/migrations/2026-10-28a-view-cafin-permission.sql</w:t>
+      </w:r>
+      <w:br/>
+      <w:r>
+        <w:rPr>
+          <w:rFonts w:ascii="Consolas" w:hAnsi="Consolas" w:eastAsia="Consolas" w:cs="Consolas"/>
+          <w:color w:val="1E3A5F"/>
+          <w:sz w:val="18"/>
+          <w:szCs w:val="18"/>
+        </w:rPr>
+        <w:t xml:space="preserve">mysql -u &lt;db_user&gt; -p &lt;database&gt; &lt; docs/migrations/2026-10-28c-payment-terms-approval.sql</w:t>
+      </w:r>
+      <w:br/>
+      <w:r>
+        <w:rPr>
+          <w:rFonts w:ascii="Consolas" w:hAnsi="Consolas" w:eastAsia="Consolas" w:cs="Consolas"/>
+          <w:color w:val="1E3A5F"/>
+          <w:sz w:val="18"/>
+          <w:szCs w:val="18"/>
+        </w:rPr>
+        <w:t xml:space="preserve">mysql -u &lt;db_user&gt; -p &lt;database&gt; &lt; docs/migrations/2026-10-28d-ca-view-orders.sql</w:t>
+      </w:r>
+      <w:br/>
+      <w:r>
+        <w:rPr>
+          <w:rFonts w:ascii="Consolas" w:hAnsi="Consolas" w:eastAsia="Consolas" w:cs="Consolas"/>
+          <w:color w:val="1E3A5F"/>
+          <w:sz w:val="18"/>
+          <w:szCs w:val="18"/>
+        </w:rPr>
+        <w:t xml:space="preserve">mysql -u &lt;db_user&gt; -p &lt;database&gt; &lt; docs/migrations/2026-10-28e-vendor-bill-proforma-and-payments.sql</w:t>
+      </w:r>
+      <w:br/>
+      <w:r>
+        <w:rPr>
+          <w:rFonts w:ascii="Consolas" w:hAnsi="Consolas" w:eastAsia="Consolas" w:cs="Consolas"/>
+          <w:color w:val="1E3A5F"/>
+          <w:sz w:val="18"/>
+          <w:szCs w:val="18"/>
+        </w:rPr>
+        <w:t xml:space="preserve">mysql -u &lt;db_user&gt; -p &lt;database&gt; &lt; docs/migrations/2026-10-29a-zoho-stage2-invoices.sql</w:t>
+      </w:r>
+      <w:br/>
+      <w:r>
+        <w:rPr>
+          <w:rFonts w:ascii="Consolas" w:hAnsi="Consolas" w:eastAsia="Consolas" w:cs="Consolas"/>
+          <w:color w:val="1E3A5F"/>
+          <w:sz w:val="18"/>
+          <w:szCs w:val="18"/>
+        </w:rPr>
+        <w:t xml:space="preserve">mysql -u &lt;db_user&gt; -p &lt;database&gt; &lt; docs/migrations/2026-10-29b-zoho-stage3-purchases.sql</w:t>
+      </w:r>
+      <w:br/>
+      <w:r>
+        <w:rPr>
+          <w:rFonts w:ascii="Consolas" w:hAnsi="Consolas" w:eastAsia="Consolas" w:cs="Consolas"/>
+          <w:color w:val="1E3A5F"/>
+          <w:sz w:val="18"/>
+          <w:szCs w:val="18"/>
+        </w:rPr>
+        <w:t xml:space="preserve">mysql -u &lt;db_user&gt; -p &lt;database&gt; &lt; docs/migrations/2026-10-29c-two-digit-year-references.sql</w:t>
+      </w:r>
+      <w:br/>
+      <w:r>
+        <w:rPr>
+          <w:rFonts w:ascii="Consolas" w:hAnsi="Consolas" w:eastAsia="Consolas" w:cs="Consolas"/>
+          <w:color w:val="1E3A5F"/>
+          <w:sz w:val="18"/>
+          <w:szCs w:val="18"/>
+        </w:rPr>
+        <w:t xml:space="preserve">mysql -u &lt;db_user&gt; -p &lt;database&gt; &lt; docs/migrations/2026-10-29d-zoho-sync-start-date.sql</w:t>
+      </w:r>
+      <w:br/>
+      <w:r>
+        <w:rPr>
+          <w:rFonts w:ascii="Consolas" w:hAnsi="Consolas" w:eastAsia="Consolas" w:cs="Consolas"/>
+          <w:color w:val="1E3A5F"/>
+          <w:sz w:val="18"/>
+          <w:szCs w:val="18"/>
+        </w:rPr>
+        <w:t xml:space="preserve">mysql -u &lt;db_user&gt; -p &lt;database&gt; &lt; docs/migrations/2026-10-29e-shipping-bill-and-reverse-charge.sql</w:t>
+      </w:r>
+      <w:br/>
+      <w:r>
+        <w:rPr>
+          <w:rFonts w:ascii="Consolas" w:hAnsi="Consolas" w:eastAsia="Consolas" w:cs="Consolas"/>
+          <w:color w:val="1E3A5F"/>
+          <w:sz w:val="18"/>
+          <w:szCs w:val="18"/>
+        </w:rPr>
+        <w:t xml:space="preserve">mysql -u &lt;db_user&gt; -p &lt;database&gt; &lt; docs/migrations/2026-10-29f-zoho-costs-lc-benefits.sql</w:t>
+      </w:r>
+      <w:br/>
+      <w:r>
+        <w:rPr>
+          <w:rFonts w:ascii="Consolas" w:hAnsi="Consolas" w:eastAsia="Consolas" w:cs="Consolas"/>
+          <w:color w:val="1E3A5F"/>
+          <w:sz w:val="18"/>
+          <w:szCs w:val="18"/>
+        </w:rPr>
+        <w:t xml:space="preserve">mysql -u &lt;db_user&gt; -p &lt;database&gt; &lt; docs/migrations/2026-10-30c-ca-view-all-orders.sql</w:t>
       </w:r>
     </w:p>
     <w:p>

</xml_diff>

<commit_message>
Docs audit (30 Oct): architecture, role matrix, deployment guides, change log, Step 12d in the CA SOP
- ARCHITECTURE.md (both) and ARCHITECTURE.html: team incentives and
  associates (Section CN), CAFIN export, stage document notice, CA sees all
  orders, associate agreement and buyer PO received date, tests added.
- READMEs and TEST_PLANs: current role matrix (63 permissions; Admin and MD
  63, ED 61; incentive permissions in the Export, Accounts and Logistics
  lists).
- Deployment guides (.docx): 119 tables, 232 foreign keys; migrations 30c
  and 30d in the go-live checklist.
- Change Log: 2-digit year reference numbers (29 Oct); no buyer-facing
  document changed on 29–30 Oct.
- SOP ca-08: Step 12d Team Incentive (copied to both stacks).

Co-Authored-By: Claude Opus 5.5 <noreply@anthropic.com>
Claude-Session: https://claude.ai/code/session_013MWU8K3FqMGawUYuNXSyb3
</commit_message>
<xml_diff>
--- a/NODE_MySQL_Version/NexaCrest_Node_Deployment_Guide.docx
+++ b/NODE_MySQL_Version/NexaCrest_Node_Deployment_Guide.docx
@@ -328,7 +328,7 @@
           <w:sz w:val="18"/>
           <w:szCs w:val="18"/>
         </w:rPr>
-        <w:t xml:space="preserve">  schema.sql              the MySQL schema — 113 tables, 218 foreign keys (29 Oct 2026)</w:t>
+        <w:t xml:space="preserve">  schema.sql              the MySQL schema — 119 tables, 232 foreign keys (30 Oct 2026)</w:t>
       </w:r>
       <w:br/>
       <w:r>
@@ -1005,7 +1005,7 @@
       </w:pPr>
       <w:r>
         <w:rPr/>
-        <w:t xml:space="preserve">This creates all 113 tables (as of 29 October 2026; 52 at the time of this delivery) and seeds: the roles/permissions matrix, one Admin login, company settings (with PLACEHOLDER values you must replace — see below), lookup tables (incoterms, currencies, ports, T&amp;C clauses, payment presets), and 5 placeholder brand assets (logo, signature, seal, watermark, email header).</w:t>
+        <w:t xml:space="preserve">This creates all 119 tables (as of 30 October 2026; 52 at the time of this delivery) and seeds: the roles/permissions matrix, one Admin login, company settings (with PLACEHOLDER values you must replace — see below), lookup tables (incoterms, currencies, ports, T&amp;C clauses, payment presets), and 5 placeholder brand assets (logo, signature, seal, watermark, email header).</w:t>
       </w:r>
       <w:r>
         <w:rPr>
@@ -3711,7 +3711,7 @@
       </w:r>
       <w:r>
         <w:rPr/>
-        <w:t xml:space="preserve"> back up, run every migration the live database does not have yet with the host's MySQL (2026-10-29e, 2026-10-29f and 2026-10-30a are the Zoho ones, 2026-10-30b the team incentives; see "Upgrading an existing installation" above), then deploy the code and restart Node (</w:t>
+        <w:t xml:space="preserve"> back up, run every migration the live database does not have yet with the host's MySQL (2026-10-29e, 2026-10-29f and 2026-10-30a are the Zoho ones, 2026-10-30b the team incentives, 2026-10-30c the CA seeing every order, 2026-10-30d the associate agreement and buyer PO date; see "Upgrading an existing installation" above), then deploy the code and restart Node (</w:t>
       </w:r>
       <w:r>
         <w:rPr>

</xml_diff>